<commit_message>
docs: refine portfolio transition contracts
</commit_message>
<xml_diff>
--- a/docs/DOC-033 — Portfolio Transition Capability.docx
+++ b/docs/DOC-033 — Portfolio Transition Capability.docx
@@ -131,7 +131,7 @@
         <w:rPr>
           <w:rtl w:val="0"/>
         </w:rPr>
-        <w:t xml:space="preserve"> Draft</w:t>
+        <w:t xml:space="preserve"> Approved </w:t>
       </w:r>
     </w:p>
     <w:p>
@@ -1441,7 +1441,42 @@
         <w:rPr>
           <w:rtl w:val="0"/>
         </w:rPr>
-        <w:t xml:space="preserve">No se autorizan contratos públicos adicionales dentro de la presente Capability.</w:t>
+        <w:t xml:space="preserve">PortfolioTransition constituye el único contrato público de salida de la Capability.</w:t>
+      </w:r>
+    </w:p>
+    <w:p>
+      <w:pPr>
+        <w:spacing w:after="240" w:before="240" w:lineRule="auto"/>
+        <w:rPr/>
+      </w:pPr>
+      <w:r>
+        <w:rPr>
+          <w:rtl w:val="0"/>
+        </w:rPr>
+        <w:t xml:space="preserve">La representación pública de dicho contrato podrá estar compuesta por valores públicos tipados que formen parte de su estructura contractual.</w:t>
+      </w:r>
+    </w:p>
+    <w:p>
+      <w:pPr>
+        <w:spacing w:after="240" w:before="240" w:lineRule="auto"/>
+        <w:rPr/>
+      </w:pPr>
+      <w:r>
+        <w:rPr>
+          <w:rtl w:val="0"/>
+        </w:rPr>
+        <w:t xml:space="preserve">Estos valores no constituyen contratos públicos de salida adicionales ni representan activos de dominio independientes.</w:t>
+      </w:r>
+    </w:p>
+    <w:p>
+      <w:pPr>
+        <w:spacing w:after="240" w:before="240" w:lineRule="auto"/>
+        <w:rPr/>
+      </w:pPr>
+      <w:r>
+        <w:rPr>
+          <w:rtl w:val="0"/>
+        </w:rPr>
       </w:r>
     </w:p>
     <w:p>
@@ -2133,7 +2168,30 @@
         <w:rPr>
           <w:rtl w:val="0"/>
         </w:rPr>
-        <w:t xml:space="preserve">No se autoriza la incorporación de contratos públicos adicionales que representen parcialmente la misma responsabilidad arquitectónica.</w:t>
+        <w:t xml:space="preserve">No se autoriza la incorporación de contratos públicos de salida adicionales.</w:t>
+      </w:r>
+    </w:p>
+    <w:p>
+      <w:pPr>
+        <w:spacing w:after="240" w:before="240" w:lineRule="auto"/>
+        <w:rPr/>
+      </w:pPr>
+      <w:r>
+        <w:rPr>
+          <w:rtl w:val="0"/>
+        </w:rPr>
+        <w:t xml:space="preserve">La composición estructural del contrato podrá incorporar valores públicos tipados cuando éstos formen parte de la representación contractual del único contrato publicado por la Capability.</w:t>
+      </w:r>
+    </w:p>
+    <w:p>
+      <w:pPr>
+        <w:spacing w:after="240" w:before="240" w:lineRule="auto"/>
+        <w:rPr/>
+      </w:pPr>
+      <w:r>
+        <w:rPr>
+          <w:rtl w:val="0"/>
+        </w:rPr>
       </w:r>
     </w:p>
     <w:p>

</xml_diff>